<commit_message>
Proje son hale getirildi, rapor hocanin sablonuna gore guncellendi ve temizlik yapildi
</commit_message>
<xml_diff>
--- a/docs/Laleli_Kozmetik_Final_Rapor.docx
+++ b/docs/Laleli_Kozmetik_Final_Rapor.docx
@@ -3093,7 +3093,7 @@
       <w:r>
         <w:drawing>
           <wp:inline xmlns:a="http://schemas.openxmlformats.org/drawingml/2006/main" xmlns:pic="http://schemas.openxmlformats.org/drawingml/2006/picture">
-            <wp:extent cx="5943600" cy="3311434"/>
+            <wp:extent cx="5943600" cy="3442378"/>
             <wp:docPr id="2" name="Picture 2"/>
             <wp:cNvGraphicFramePr>
               <a:graphicFrameLocks noChangeAspect="1"/>
@@ -3102,7 +3102,7 @@
               <a:graphicData uri="http://schemas.openxmlformats.org/drawingml/2006/picture">
                 <pic:pic>
                   <pic:nvPicPr>
-                    <pic:cNvPr id="0" name="kategori_yonetimi_ekrani.png"/>
+                    <pic:cNvPr id="0" name="04_kategoriler.png"/>
                     <pic:cNvPicPr/>
                   </pic:nvPicPr>
                   <pic:blipFill>
@@ -3114,7 +3114,7 @@
                   <pic:spPr>
                     <a:xfrm>
                       <a:off x="0" y="0"/>
-                      <a:ext cx="5943600" cy="3311434"/>
+                      <a:ext cx="5943600" cy="3442378"/>
                     </a:xfrm>
                     <a:prstGeom prst="rect"/>
                   </pic:spPr>
@@ -3140,7 +3140,7 @@
       <w:r>
         <w:drawing>
           <wp:inline xmlns:a="http://schemas.openxmlformats.org/drawingml/2006/main" xmlns:pic="http://schemas.openxmlformats.org/drawingml/2006/picture">
-            <wp:extent cx="5943600" cy="3311434"/>
+            <wp:extent cx="5943600" cy="3442378"/>
             <wp:docPr id="3" name="Picture 3"/>
             <wp:cNvGraphicFramePr>
               <a:graphicFrameLocks noChangeAspect="1"/>
@@ -3149,7 +3149,7 @@
               <a:graphicData uri="http://schemas.openxmlformats.org/drawingml/2006/picture">
                 <pic:pic>
                   <pic:nvPicPr>
-                    <pic:cNvPr id="0" name="urun_yonetimi_ekrani.png"/>
+                    <pic:cNvPr id="0" name="01_urun_yonetimi.png"/>
                     <pic:cNvPicPr/>
                   </pic:nvPicPr>
                   <pic:blipFill>
@@ -3161,7 +3161,7 @@
                   <pic:spPr>
                     <a:xfrm>
                       <a:off x="0" y="0"/>
-                      <a:ext cx="5943600" cy="3311434"/>
+                      <a:ext cx="5943600" cy="3442378"/>
                     </a:xfrm>
                     <a:prstGeom prst="rect"/>
                   </pic:spPr>
@@ -3187,7 +3187,7 @@
       <w:r>
         <w:drawing>
           <wp:inline xmlns:a="http://schemas.openxmlformats.org/drawingml/2006/main" xmlns:pic="http://schemas.openxmlformats.org/drawingml/2006/picture">
-            <wp:extent cx="5943600" cy="3311434"/>
+            <wp:extent cx="5943600" cy="3442378"/>
             <wp:docPr id="4" name="Picture 4"/>
             <wp:cNvGraphicFramePr>
               <a:graphicFrameLocks noChangeAspect="1"/>
@@ -3196,7 +3196,7 @@
               <a:graphicData uri="http://schemas.openxmlformats.org/drawingml/2006/picture">
                 <pic:pic>
                   <pic:nvPicPr>
-                    <pic:cNvPr id="0" name="musteri_kaydi_ekrani.png"/>
+                    <pic:cNvPr id="0" name="02_musteri_kaydi.png"/>
                     <pic:cNvPicPr/>
                   </pic:nvPicPr>
                   <pic:blipFill>
@@ -3208,7 +3208,7 @@
                   <pic:spPr>
                     <a:xfrm>
                       <a:off x="0" y="0"/>
-                      <a:ext cx="5943600" cy="3311434"/>
+                      <a:ext cx="5943600" cy="3442378"/>
                     </a:xfrm>
                     <a:prstGeom prst="rect"/>
                   </pic:spPr>
@@ -3234,7 +3234,7 @@
       <w:r>
         <w:drawing>
           <wp:inline xmlns:a="http://schemas.openxmlformats.org/drawingml/2006/main" xmlns:pic="http://schemas.openxmlformats.org/drawingml/2006/picture">
-            <wp:extent cx="5943600" cy="3311434"/>
+            <wp:extent cx="5943600" cy="3442378"/>
             <wp:docPr id="5" name="Picture 5"/>
             <wp:cNvGraphicFramePr>
               <a:graphicFrameLocks noChangeAspect="1"/>
@@ -3243,7 +3243,7 @@
               <a:graphicData uri="http://schemas.openxmlformats.org/drawingml/2006/picture">
                 <pic:pic>
                   <pic:nvPicPr>
-                    <pic:cNvPr id="0" name="satis_ekrani.png"/>
+                    <pic:cNvPr id="0" name="03_satis_ekrani.png"/>
                     <pic:cNvPicPr/>
                   </pic:nvPicPr>
                   <pic:blipFill>
@@ -3255,7 +3255,7 @@
                   <pic:spPr>
                     <a:xfrm>
                       <a:off x="0" y="0"/>
-                      <a:ext cx="5943600" cy="3311434"/>
+                      <a:ext cx="5943600" cy="3442378"/>
                     </a:xfrm>
                     <a:prstGeom prst="rect"/>
                   </pic:spPr>
@@ -3272,6 +3272,22 @@
       </w:pPr>
       <w:r>
         <w:rPr>
+          <w:color w:val="2E74B5"/>
+        </w:rPr>
+        <w:t>GitHub Linki</w:t>
+      </w:r>
+    </w:p>
+    <w:p>
+      <w:r>
+        <w:t>https://github.com/emirllli/LaleliKozmetik-Veritabani-Projesi</w:t>
+      </w:r>
+    </w:p>
+    <w:p>
+      <w:pPr>
+        <w:pStyle w:val="Heading1"/>
+      </w:pPr>
+      <w:r>
+        <w:rPr>
           <w:rFonts w:ascii="Calibri" w:hAnsi="Calibri"/>
           <w:color w:val="2E74B5"/>
         </w:rPr>
@@ -3279,51 +3295,8 @@
       </w:r>
     </w:p>
     <w:p>
-      <w:pPr>
-        <w:pStyle w:val="ListBullet"/>
-      </w:pPr>
       <w:r>
-        <w:t>SQL scripti: sql/laleli_kozmetik_database.sql dosyasi MySQL uzerinde calistirilir.</w:t>
-      </w:r>
-    </w:p>
-    <w:p>
-      <w:pPr>
-        <w:pStyle w:val="ListBullet"/>
-      </w:pPr>
-      <w:r>
-        <w:t>C# proje: LaleliKozmetik.sln Visual Studio ile acilir ve calistirilir.</w:t>
-      </w:r>
-    </w:p>
-    <w:p>
-      <w:pPr>
-        <w:pStyle w:val="ListBullet"/>
-      </w:pPr>
-      <w:r>
-        <w:t>Video 1: MySQL tarafinda trigger ve function gosterilir.</w:t>
-      </w:r>
-    </w:p>
-    <w:p>
-      <w:pPr>
-        <w:pStyle w:val="ListBullet"/>
-      </w:pPr>
-      <w:r>
-        <w:t>Video 2: Uygulamada kategori, urun, musteri ve satis CRUD islemleri gosterilir.</w:t>
-      </w:r>
-    </w:p>
-    <w:p>
-      <w:pPr>
-        <w:pStyle w:val="ListBullet"/>
-      </w:pPr>
-      <w:r>
-        <w:t>Video 3: Satis yapildiktan sonra stok miktarinin dustugu, satis silinince stok iadesi oldugu gosterilir.</w:t>
-      </w:r>
-    </w:p>
-    <w:p>
-      <w:pPr>
-        <w:pStyle w:val="ListBullet"/>
-      </w:pPr>
-      <w:r>
-        <w:t>GitHub: Tum proje, SQL scripti, ER diyagrami ve rapor yuklenir.</w:t>
+        <w:t xml:space="preserve">Video linki: </w:t>
       </w:r>
     </w:p>
     <w:sectPr>

</xml_diff>

<commit_message>
Temizlik: video akisi maddeleri rapordan temizlendi
</commit_message>
<xml_diff>
--- a/docs/Laleli_Kozmetik_Final_Rapor.docx
+++ b/docs/Laleli_Kozmetik_Final_Rapor.docx
@@ -3196,55 +3196,7 @@
           <w:rFonts w:ascii="Calibri" w:hAnsi="Calibri"/>
           <w:color w:val="2E74B5"/>
         </w:rPr>
-        <w:t>ADIM-5: Teslimat ve Video Akışı</w:t>
-      </w:r>
-    </w:p>
-    <w:p>
-      <w:pPr>
-        <w:pStyle w:val="ListBullet"/>
-      </w:pPr>
-      <w:r>
-        <w:t>SQL scripti: sql/laleli_kozmetik_database.sql dosyası MySQL üzerinde çalıştırılır.</w:t>
-      </w:r>
-    </w:p>
-    <w:p>
-      <w:pPr>
-        <w:pStyle w:val="ListBullet"/>
-      </w:pPr>
-      <w:r>
-        <w:t>C# proje: LaleliKozmetik.sln Visual Studio ile açılır ve çalıştırılır.</w:t>
-      </w:r>
-    </w:p>
-    <w:p>
-      <w:pPr>
-        <w:pStyle w:val="ListBullet"/>
-      </w:pPr>
-      <w:r>
-        <w:t>Video 1: MySQL tarafında trigger ve function gösterilir.</w:t>
-      </w:r>
-    </w:p>
-    <w:p>
-      <w:pPr>
-        <w:pStyle w:val="ListBullet"/>
-      </w:pPr>
-      <w:r>
-        <w:t>Video 2: Uygulamada kategori, ürün, müşteri ve satış CRUD işlemleri gösterilir.</w:t>
-      </w:r>
-    </w:p>
-    <w:p>
-      <w:pPr>
-        <w:pStyle w:val="ListBullet"/>
-      </w:pPr>
-      <w:r>
-        <w:t>Video 3: Satış yapıldıktan sonra stok miktarının düştüğü, satış silinince stok iadesi olduğu gösterilir.</w:t>
-      </w:r>
-    </w:p>
-    <w:p>
-      <w:pPr>
-        <w:pStyle w:val="ListBullet"/>
-      </w:pPr>
-      <w:r>
-        <w:t>GitHub: Tüm proje, SQL scripti, ER diyagramı ve rapor yüklenir.</w:t>
+        <w:t>ADIM-5: Teslimat ve Video Sunumu</w:t>
       </w:r>
     </w:p>
     <w:p/>

</xml_diff>

<commit_message>
\Rapor: ER diyagrami ve Iliskisel sema ayri bolumler olarak eklendi"
</commit_message>
<xml_diff>
--- a/docs/Laleli_Kozmetik_Final_Rapor.docx
+++ b/docs/Laleli_Kozmetik_Final_Rapor.docx
@@ -59,7 +59,7 @@
         <w:pStyle w:val="ListBullet"/>
       </w:pPr>
       <w:r>
-        <w:t>Problem: Stok takibi defter veya dağınık dosyalarla yapıldığı için güncel stok miktarı hızlı görülememektedir.</w:t>
+        <w:t>Problem: Stok takibi defter veya dağınık dosyalarla yapıldığı için güncel stok miktari hızlı görülememektedir.</w:t>
       </w:r>
     </w:p>
     <w:p>
@@ -256,8 +256,59 @@
       <w:r>
         <w:drawing>
           <wp:inline xmlns:a="http://schemas.openxmlformats.org/drawingml/2006/main" xmlns:pic="http://schemas.openxmlformats.org/drawingml/2006/picture">
+            <wp:extent cx="5943600" cy="3608614"/>
+            <wp:docPr id="1" name="Picture 1"/>
+            <wp:cNvGraphicFramePr>
+              <a:graphicFrameLocks noChangeAspect="1"/>
+            </wp:cNvGraphicFramePr>
+            <a:graphic>
+              <a:graphicData uri="http://schemas.openxmlformats.org/drawingml/2006/picture">
+                <pic:pic>
+                  <pic:nvPicPr>
+                    <pic:cNvPr id="0" name="er_diagram.png"/>
+                    <pic:cNvPicPr/>
+                  </pic:nvPicPr>
+                  <pic:blipFill>
+                    <a:blip r:embed="rId9"/>
+                    <a:stretch>
+                      <a:fillRect/>
+                    </a:stretch>
+                  </pic:blipFill>
+                  <pic:spPr>
+                    <a:xfrm>
+                      <a:off x="0" y="0"/>
+                      <a:ext cx="5943600" cy="3608614"/>
+                    </a:xfrm>
+                    <a:prstGeom prst="rect"/>
+                  </pic:spPr>
+                </pic:pic>
+              </a:graphicData>
+            </a:graphic>
+          </wp:inline>
+        </w:drawing>
+      </w:r>
+    </w:p>
+    <w:p>
+      <w:pPr>
+        <w:pStyle w:val="Heading2"/>
+      </w:pPr>
+      <w:r>
+        <w:rPr>
+          <w:rFonts w:ascii="Calibri" w:hAnsi="Calibri"/>
+          <w:color w:val="2E7478"/>
+        </w:rPr>
+        <w:t>İlişkisel (Mantıksal) Şema</w:t>
+      </w:r>
+    </w:p>
+    <w:p>
+      <w:pPr>
+        <w:jc w:val="center"/>
+      </w:pPr>
+      <w:r>
+        <w:drawing>
+          <wp:inline xmlns:a="http://schemas.openxmlformats.org/drawingml/2006/main" xmlns:pic="http://schemas.openxmlformats.org/drawingml/2006/picture">
             <wp:extent cx="5943600" cy="5305127"/>
-            <wp:docPr id="1" name="Picture 1"/>
+            <wp:docPr id="2" name="Picture 2"/>
             <wp:cNvGraphicFramePr>
               <a:graphicFrameLocks noChangeAspect="1"/>
             </wp:cNvGraphicFramePr>
@@ -269,7 +320,7 @@
                     <pic:cNvPicPr/>
                   </pic:nvPicPr>
                   <pic:blipFill>
-                    <a:blip r:embed="rId9"/>
+                    <a:blip r:embed="rId10"/>
                     <a:stretch>
                       <a:fillRect/>
                     </a:stretch>
@@ -286,18 +337,6 @@
             </a:graphic>
           </wp:inline>
         </w:drawing>
-      </w:r>
-    </w:p>
-    <w:p>
-      <w:pPr>
-        <w:pStyle w:val="Heading2"/>
-      </w:pPr>
-      <w:r>
-        <w:rPr>
-          <w:rFonts w:ascii="Calibri" w:hAnsi="Calibri"/>
-          <w:color w:val="2E7478"/>
-        </w:rPr>
-        <w:t>İlişkisel (Mantıksal) Şema</w:t>
       </w:r>
     </w:p>
     <w:p>
@@ -3015,7 +3054,7 @@
         <w:drawing>
           <wp:inline xmlns:a="http://schemas.openxmlformats.org/drawingml/2006/main" xmlns:pic="http://schemas.openxmlformats.org/drawingml/2006/picture">
             <wp:extent cx="5943600" cy="3442378"/>
-            <wp:docPr id="2" name="Picture 2"/>
+            <wp:docPr id="3" name="Picture 3"/>
             <wp:cNvGraphicFramePr>
               <a:graphicFrameLocks noChangeAspect="1"/>
             </wp:cNvGraphicFramePr>
@@ -3027,7 +3066,7 @@
                     <pic:cNvPicPr/>
                   </pic:nvPicPr>
                   <pic:blipFill>
-                    <a:blip r:embed="rId10"/>
+                    <a:blip r:embed="rId11"/>
                     <a:stretch>
                       <a:fillRect/>
                     </a:stretch>
@@ -3062,7 +3101,7 @@
         <w:drawing>
           <wp:inline xmlns:a="http://schemas.openxmlformats.org/drawingml/2006/main" xmlns:pic="http://schemas.openxmlformats.org/drawingml/2006/picture">
             <wp:extent cx="5943600" cy="3442378"/>
-            <wp:docPr id="3" name="Picture 3"/>
+            <wp:docPr id="4" name="Picture 4"/>
             <wp:cNvGraphicFramePr>
               <a:graphicFrameLocks noChangeAspect="1"/>
             </wp:cNvGraphicFramePr>
@@ -3074,7 +3113,7 @@
                     <pic:cNvPicPr/>
                   </pic:nvPicPr>
                   <pic:blipFill>
-                    <a:blip r:embed="rId11"/>
+                    <a:blip r:embed="rId12"/>
                     <a:stretch>
                       <a:fillRect/>
                     </a:stretch>
@@ -3109,7 +3148,7 @@
         <w:drawing>
           <wp:inline xmlns:a="http://schemas.openxmlformats.org/drawingml/2006/main" xmlns:pic="http://schemas.openxmlformats.org/drawingml/2006/picture">
             <wp:extent cx="5943600" cy="3442378"/>
-            <wp:docPr id="4" name="Picture 4"/>
+            <wp:docPr id="5" name="Picture 5"/>
             <wp:cNvGraphicFramePr>
               <a:graphicFrameLocks noChangeAspect="1"/>
             </wp:cNvGraphicFramePr>
@@ -3121,7 +3160,7 @@
                     <pic:cNvPicPr/>
                   </pic:nvPicPr>
                   <pic:blipFill>
-                    <a:blip r:embed="rId12"/>
+                    <a:blip r:embed="rId13"/>
                     <a:stretch>
                       <a:fillRect/>
                     </a:stretch>
@@ -3156,7 +3195,7 @@
         <w:drawing>
           <wp:inline xmlns:a="http://schemas.openxmlformats.org/drawingml/2006/main" xmlns:pic="http://schemas.openxmlformats.org/drawingml/2006/picture">
             <wp:extent cx="5943600" cy="3442378"/>
-            <wp:docPr id="5" name="Picture 5"/>
+            <wp:docPr id="6" name="Picture 6"/>
             <wp:cNvGraphicFramePr>
               <a:graphicFrameLocks noChangeAspect="1"/>
             </wp:cNvGraphicFramePr>
@@ -3168,7 +3207,7 @@
                     <pic:cNvPicPr/>
                   </pic:nvPicPr>
                   <pic:blipFill>
-                    <a:blip r:embed="rId13"/>
+                    <a:blip r:embed="rId14"/>
                     <a:stretch>
                       <a:fillRect/>
                     </a:stretch>

</xml_diff>

<commit_message>
Uygulama ve Rapor: Stok Durumu arayuze ve rapora entegre edildi
</commit_message>
<xml_diff>
--- a/docs/Laleli_Kozmetik_Final_Rapor.docx
+++ b/docs/Laleli_Kozmetik_Final_Rapor.docx
@@ -2530,7 +2530,7 @@
           <w:rFonts w:ascii="Consolas" w:hAnsi="Consolas"/>
           <w:sz w:val="17"/>
         </w:rPr>
-        <w:t xml:space="preserve">           u.stok_miktari, u.barkod</w:t>
+        <w:t xml:space="preserve">           u.stok_miktari, fn_stok_durumu(u.stok_miktari) AS stok_durumu, u.barkod</w:t>
       </w:r>
     </w:p>
     <w:p>
@@ -4756,7 +4756,7 @@
           <w:rFonts w:ascii="Consolas" w:hAnsi="Consolas"/>
           <w:sz w:val="17"/>
         </w:rPr>
-        <w:t xml:space="preserve">           u.stok_miktari, u.barkod</w:t>
+        <w:t xml:space="preserve">           u.stok_miktari, fn_stok_durumu(u.stok_miktari) AS stok_durumu, u.barkod</w:t>
       </w:r>
     </w:p>
     <w:p>

</xml_diff>

<commit_message>
Rapor ve Arayuz: Orijinal Urun Yonetimi ekran goruntusu kirpilip yerlestirildi
</commit_message>
<xml_diff>
--- a/docs/Laleli_Kozmetik_Final_Rapor.docx
+++ b/docs/Laleli_Kozmetik_Final_Rapor.docx
@@ -987,7 +987,7 @@
     </w:p>
     <w:p>
       <w:r>
-        <w:t>Açıklama: Gerleşen tüm satış hareketlerini kaydeder. Her satış kaydı bir ürün (urun_id FK) ve bir müşteri (musteri_id FK) ile ilişkilidir. Satış adedinin 0 veya negatif olamayacağına dair chk_satis_adet kısıtı içerir.</w:t>
+        <w:t>Açıklama: Gerçekleşen tüm satış hareketlerini kaydeder. Her satış kaydı bir ürün (urun_id FK) ve bir müşteri (musteri_id FK) ile ilişkilidir. Satış adedinin 0 veya negatif olamayacağına dair chk_satis_adet kısıtı içerir.</w:t>
       </w:r>
     </w:p>
     <w:p>
@@ -8241,7 +8241,7 @@
       <w:r>
         <w:drawing>
           <wp:inline xmlns:a="http://schemas.openxmlformats.org/drawingml/2006/main" xmlns:pic="http://schemas.openxmlformats.org/drawingml/2006/picture">
-            <wp:extent cx="5943600" cy="3442378"/>
+            <wp:extent cx="5943600" cy="3621881"/>
             <wp:docPr id="4" name="Picture 4"/>
             <wp:cNvGraphicFramePr>
               <a:graphicFrameLocks noChangeAspect="1"/>
@@ -8262,7 +8262,7 @@
                   <pic:spPr>
                     <a:xfrm>
                       <a:off x="0" y="0"/>
-                      <a:ext cx="5943600" cy="3442378"/>
+                      <a:ext cx="5943600" cy="3621881"/>
                     </a:xfrm>
                     <a:prstGeom prst="rect"/>
                   </pic:spPr>

</xml_diff>